<commit_message>
deliverables: correct BI-V150 official baseline to 2028.01/915.15 (the 2239/2956 figures were same-day stock measurements, not the official baseline), gains now +28.5%/+287%
</commit_message>
<xml_diff>
--- a/docs/deliverables/report.docx
+++ b/docs/deliverables/report.docx
@@ -57,7 +57,7 @@
     </w:p>
     <w:p>
       <w:r>
-        <w:t>性能方面，沐曦 C500 平台 4k 场景总吞吐达到 11868.79–12403.21 tok/s，为官方基线的 2.33–2.44 倍；16k 场景达到 11098.02–11167.87 tok/s，为基线的 1.58–1.59 倍。天数 BI-V150 平台在同日交错 A/B 下，4k 场景提升 16.4%、16k 场景提升 19.8%。精度方面，MATH-500 Level 3 保持在 96.2%–98.1%，高于 95% 的赛题要求；TTFT 在各场景均未回退。</w:t>
+        <w:t>性能方面，沐曦 C500 平台 4k 场景总吞吐达到 11868.79–12403.21 tok/s，为官方基线的 2.33–2.44 倍；16k 场景达到 11098.02–11167.87 tok/s，为基线的 1.58–1.59 倍。天数 BI-V150 平台 4k 场景由官网基线 2028.01 提升至 2606.56 tok/s（+28.5%），16k 场景由 915.15 提升至 3541.34 tok/s（+287%）；其中 A20 自研内核在同日交错 A/B 下，相对当日 stock 再提升 16.4% 与 19.8%。精度方面，MATH-500 Level 3 保持在 96.2%–98.1%，高于 95% 的赛题要求；TTFT 在各场景均未回退。</w:t>
       </w:r>
     </w:p>
     <w:p>
@@ -1126,11 +1126,7 @@
               <w:jc w:val="center"/>
             </w:pPr>
             <w:r>
-              <w:rPr>
-                <w:color w:val="1F2933"/>
-                <w:sz w:val="22"/>
-              </w:rPr>
-              <w:t>2239.43（当日基线）</w:t>
+              <w:t>2028.01（官网基线）</w:t>
             </w:r>
           </w:p>
         </w:tc>
@@ -1180,11 +1176,7 @@
               <w:jc w:val="center"/>
             </w:pPr>
             <w:r>
-              <w:rPr>
-                <w:color w:val="1F2933"/>
-                <w:sz w:val="22"/>
-              </w:rPr>
-              <w:t>+16.4%</w:t>
+              <w:t>+28.5%</w:t>
             </w:r>
           </w:p>
         </w:tc>
@@ -1263,11 +1255,7 @@
               <w:jc w:val="center"/>
             </w:pPr>
             <w:r>
-              <w:rPr>
-                <w:color w:val="1F2933"/>
-                <w:sz w:val="22"/>
-              </w:rPr>
-              <w:t>2956.59（当日基线）</w:t>
+              <w:t>915.15（官网基线）</w:t>
             </w:r>
           </w:p>
         </w:tc>
@@ -1317,11 +1305,7 @@
               <w:jc w:val="center"/>
             </w:pPr>
             <w:r>
-              <w:rPr>
-                <w:color w:val="1F2933"/>
-                <w:sz w:val="22"/>
-              </w:rPr>
-              <w:t>+19.8%</w:t>
+              <w:t>+287%</w:t>
             </w:r>
           </w:p>
         </w:tc>

</xml_diff>

<commit_message>
deliverables: add appendix B with NSEG x batch heatmaps, decode bandwidth evolution and run-variance plots; also fix BI-V150 official baseline to 2028.01/915.15
</commit_message>
<xml_diff>
--- a/docs/deliverables/report.docx
+++ b/docs/deliverables/report.docx
@@ -4101,6 +4101,480 @@
         <w:t>实验记录：docs/baselines/metax-c500/（C500 基线与 opt1–opt11 逐项记录、2026-10-23/24 复核与验证）、docs/baselines/iluvatar-biv150/（天数 A1–A9 记录）、docs/experiments/（A10–A27 的探针、台账 tracking.md、runs/ 原始数据与证据）。所有候选方案的配置、serve 日志、benchmark CSV、机器状态与结论均可按目录复核。</w:t>
       </w:r>
     </w:p>
+    <w:p>
+      <w:pPr>
+        <w:pStyle w:val="一级标题"/>
+      </w:pPr>
+      <w:r>
+        <w:t>附录 B　内核形状扫描与测量可靠性</w:t>
+      </w:r>
+    </w:p>
+    <w:p>
+      <w:r>
+        <w:t>本附录给出两类支撑材料：其一为 paged decode attention 内核在 NSEG × 并发度上的实测分布（来源：docs/experiments/a26/a26_sweep.log，20 次重复取均值）；其二为官方 benchmark 连续 4 次 run 的吞吐波动（来源：docs/baselines/metax-c500/raw_runs_baseline.csv）。前者说明当前配置为何是甜点，后者说明测量口径的离散程度。</w:t>
+      </w:r>
+    </w:p>
+    <w:p>
+      <w:pPr>
+        <w:pStyle w:val="题注"/>
+        <w:jc w:val="center"/>
+      </w:pPr>
+      <w:r>
+        <w:drawing>
+          <wp:anchor distT="72000" distB="72000" distL="72000" distR="72000" simplePos="0" relativeHeight="251659264" behindDoc="0" locked="0" layoutInCell="1" allowOverlap="1">
+            <wp:simplePos x="0" y="0"/>
+            <wp:positionH relativeFrom="column">
+              <wp:align>center</wp:align>
+            </wp:positionH>
+            <wp:positionV relativeFrom="paragraph">
+              <wp:align>top</wp:align>
+            </wp:positionV>
+            <wp:extent cx="5220000" cy="3096000"/>
+            <wp:wrapTopAndBottom/>
+            <wp:docPr id="15" name="Picture 15"/>
+            <wp:cNvGraphicFramePr xmlns:a="http://schemas.openxmlformats.org/drawingml/2006/main">
+              <a:graphicFrameLocks noChangeAspect="1"/>
+            </wp:cNvGraphicFramePr>
+            <a:graphic xmlns:a="http://schemas.openxmlformats.org/drawingml/2006/main" xmlns:pic="http://schemas.openxmlformats.org/drawingml/2006/picture">
+              <a:graphicData uri="http://schemas.openxmlformats.org/drawingml/2006/picture">
+                <pic:pic>
+                  <pic:nvPicPr>
+                    <pic:cNvPr id="0" name="image.png"/>
+                    <pic:cNvPicPr/>
+                  </pic:nvPicPr>
+                  <pic:blipFill>
+                    <a:blip r:embed="rId25"/>
+                    <a:stretch>
+                      <a:fillRect/>
+                    </a:stretch>
+                  </pic:blipFill>
+                  <pic:spPr>
+                    <a:xfrm>
+                      <a:off x="0" y="0"/>
+                      <a:ext cx="5220000" cy="3096000"/>
+                    </a:xfrm>
+                    <a:prstGeom prst="rect"/>
+                  </pic:spPr>
+                </pic:pic>
+              </a:graphicData>
+            </a:graphic>
+          </wp:anchor>
+        </w:drawing>
+      </w:r>
+    </w:p>
+    <w:p>
+      <w:pPr>
+        <w:pStyle w:val="题注"/>
+        <w:jc w:val="center"/>
+      </w:pPr>
+      <w:r>
+        <w:t xml:space="preserve">图 </w:t>
+      </w:r>
+      <w:r>
+        <w:fldChar w:fldCharType="begin" w:dirty="true"/>
+      </w:r>
+      <w:r>
+        <w:instrText xml:space="preserve"> SEQ Figure \* ARABIC </w:instrText>
+      </w:r>
+      <w:r>
+        <w:fldChar w:fldCharType="separate"/>
+      </w:r>
+      <w:r>
+        <w:t>15</w:t>
+      </w:r>
+      <w:r>
+        <w:fldChar w:fldCharType="end"/>
+      </w:r>
+      <w:r>
+        <w:t xml:space="preserve"> NSEG × 并发度的耗时分布（kv=16384，ms/层）</w:t>
+      </w:r>
+    </w:p>
+    <w:p>
+      <w:pPr>
+        <w:pStyle w:val="题注"/>
+        <w:jc w:val="center"/>
+      </w:pPr>
+      <w:r>
+        <w:drawing>
+          <wp:anchor distT="72000" distB="72000" distL="72000" distR="72000" simplePos="0" relativeHeight="251659264" behindDoc="0" locked="0" layoutInCell="1" allowOverlap="1">
+            <wp:simplePos x="0" y="0"/>
+            <wp:positionH relativeFrom="column">
+              <wp:align>center</wp:align>
+            </wp:positionH>
+            <wp:positionV relativeFrom="paragraph">
+              <wp:align>top</wp:align>
+            </wp:positionV>
+            <wp:extent cx="5220000" cy="3096000"/>
+            <wp:wrapTopAndBottom/>
+            <wp:docPr id="16" name="Picture 16"/>
+            <wp:cNvGraphicFramePr xmlns:a="http://schemas.openxmlformats.org/drawingml/2006/main">
+              <a:graphicFrameLocks noChangeAspect="1"/>
+            </wp:cNvGraphicFramePr>
+            <a:graphic xmlns:a="http://schemas.openxmlformats.org/drawingml/2006/main" xmlns:pic="http://schemas.openxmlformats.org/drawingml/2006/picture">
+              <a:graphicData uri="http://schemas.openxmlformats.org/drawingml/2006/picture">
+                <pic:pic>
+                  <pic:nvPicPr>
+                    <pic:cNvPr id="0" name="image.png"/>
+                    <pic:cNvPicPr/>
+                  </pic:nvPicPr>
+                  <pic:blipFill>
+                    <a:blip r:embed="rId26"/>
+                    <a:stretch>
+                      <a:fillRect/>
+                    </a:stretch>
+                  </pic:blipFill>
+                  <pic:spPr>
+                    <a:xfrm>
+                      <a:off x="0" y="0"/>
+                      <a:ext cx="5220000" cy="3096000"/>
+                    </a:xfrm>
+                    <a:prstGeom prst="rect"/>
+                  </pic:spPr>
+                </pic:pic>
+              </a:graphicData>
+            </a:graphic>
+          </wp:anchor>
+        </w:drawing>
+      </w:r>
+    </w:p>
+    <w:p>
+      <w:pPr>
+        <w:pStyle w:val="题注"/>
+        <w:jc w:val="center"/>
+      </w:pPr>
+      <w:r>
+        <w:t xml:space="preserve">图 </w:t>
+      </w:r>
+      <w:r>
+        <w:fldChar w:fldCharType="begin" w:dirty="true"/>
+      </w:r>
+      <w:r>
+        <w:instrText xml:space="preserve"> SEQ Figure \* ARABIC </w:instrText>
+      </w:r>
+      <w:r>
+        <w:fldChar w:fldCharType="separate"/>
+      </w:r>
+      <w:r>
+        <w:t>16</w:t>
+      </w:r>
+      <w:r>
+        <w:fldChar w:fldCharType="end"/>
+      </w:r>
+      <w:r>
+        <w:t xml:space="preserve"> NSEG × 并发度的有效带宽分布（kv=16384，GB/s）</w:t>
+      </w:r>
+    </w:p>
+    <w:p>
+      <w:pPr>
+        <w:pStyle w:val="题注"/>
+        <w:jc w:val="center"/>
+      </w:pPr>
+      <w:r>
+        <w:drawing>
+          <wp:anchor distT="72000" distB="72000" distL="72000" distR="72000" simplePos="0" relativeHeight="251659264" behindDoc="0" locked="0" layoutInCell="1" allowOverlap="1">
+            <wp:simplePos x="0" y="0"/>
+            <wp:positionH relativeFrom="column">
+              <wp:align>center</wp:align>
+            </wp:positionH>
+            <wp:positionV relativeFrom="paragraph">
+              <wp:align>top</wp:align>
+            </wp:positionV>
+            <wp:extent cx="5220000" cy="3096000"/>
+            <wp:wrapTopAndBottom/>
+            <wp:docPr id="17" name="Picture 17"/>
+            <wp:cNvGraphicFramePr xmlns:a="http://schemas.openxmlformats.org/drawingml/2006/main">
+              <a:graphicFrameLocks noChangeAspect="1"/>
+            </wp:cNvGraphicFramePr>
+            <a:graphic xmlns:a="http://schemas.openxmlformats.org/drawingml/2006/main" xmlns:pic="http://schemas.openxmlformats.org/drawingml/2006/picture">
+              <a:graphicData uri="http://schemas.openxmlformats.org/drawingml/2006/picture">
+                <pic:pic>
+                  <pic:nvPicPr>
+                    <pic:cNvPr id="0" name="image.png"/>
+                    <pic:cNvPicPr/>
+                  </pic:nvPicPr>
+                  <pic:blipFill>
+                    <a:blip r:embed="rId27"/>
+                    <a:stretch>
+                      <a:fillRect/>
+                    </a:stretch>
+                  </pic:blipFill>
+                  <pic:spPr>
+                    <a:xfrm>
+                      <a:off x="0" y="0"/>
+                      <a:ext cx="5220000" cy="3096000"/>
+                    </a:xfrm>
+                    <a:prstGeom prst="rect"/>
+                  </pic:spPr>
+                </pic:pic>
+              </a:graphicData>
+            </a:graphic>
+          </wp:anchor>
+        </w:drawing>
+      </w:r>
+    </w:p>
+    <w:p>
+      <w:pPr>
+        <w:pStyle w:val="题注"/>
+        <w:jc w:val="center"/>
+      </w:pPr>
+      <w:r>
+        <w:t xml:space="preserve">图 </w:t>
+      </w:r>
+      <w:r>
+        <w:fldChar w:fldCharType="begin" w:dirty="true"/>
+      </w:r>
+      <w:r>
+        <w:instrText xml:space="preserve"> SEQ Figure \* ARABIC </w:instrText>
+      </w:r>
+      <w:r>
+        <w:fldChar w:fldCharType="separate"/>
+      </w:r>
+      <w:r>
+        <w:t>17</w:t>
+      </w:r>
+      <w:r>
+        <w:fldChar w:fldCharType="end"/>
+      </w:r>
+      <w:r>
+        <w:t xml:space="preserve"> NSEG × 并发度的耗时分布（kv=4096，ms/层）</w:t>
+      </w:r>
+    </w:p>
+    <w:p>
+      <w:r>
+        <w:t>三张热力图显示：在官方 c64 形状下，NSEG=32 恰为带宽最优点（515 GB/s，约为该卡理论带宽的 88%），继续增大 NSEG 反而因归并开销退化；小 batch 虽可通过调整 NSEG 获得 3%–7.4% 的收益，但官方两个用例均为 c64，因此未实现 shape-aware 分派（对应第 7 节 A26）。</w:t>
+      </w:r>
+    </w:p>
+    <w:p>
+      <w:pPr>
+        <w:pStyle w:val="题注"/>
+        <w:jc w:val="center"/>
+      </w:pPr>
+      <w:r>
+        <w:drawing>
+          <wp:anchor distT="72000" distB="72000" distL="72000" distR="72000" simplePos="0" relativeHeight="251659264" behindDoc="0" locked="0" layoutInCell="1" allowOverlap="1">
+            <wp:simplePos x="0" y="0"/>
+            <wp:positionH relativeFrom="column">
+              <wp:align>center</wp:align>
+            </wp:positionH>
+            <wp:positionV relativeFrom="paragraph">
+              <wp:align>top</wp:align>
+            </wp:positionV>
+            <wp:extent cx="5400000" cy="2808000"/>
+            <wp:wrapTopAndBottom/>
+            <wp:docPr id="13" name="Picture 13"/>
+            <wp:cNvGraphicFramePr xmlns:a="http://schemas.openxmlformats.org/drawingml/2006/main">
+              <a:graphicFrameLocks noChangeAspect="1"/>
+            </wp:cNvGraphicFramePr>
+            <a:graphic xmlns:a="http://schemas.openxmlformats.org/drawingml/2006/main" xmlns:pic="http://schemas.openxmlformats.org/drawingml/2006/picture">
+              <a:graphicData uri="http://schemas.openxmlformats.org/drawingml/2006/picture">
+                <pic:pic>
+                  <pic:nvPicPr>
+                    <pic:cNvPr id="0" name="fig12_decode_evolution.png"/>
+                    <pic:cNvPicPr/>
+                  </pic:nvPicPr>
+                  <pic:blipFill>
+                    <a:blip r:embed="rId23"/>
+                    <a:stretch>
+                      <a:fillRect/>
+                    </a:stretch>
+                  </pic:blipFill>
+                  <pic:spPr>
+                    <a:xfrm>
+                      <a:off x="0" y="0"/>
+                      <a:ext cx="5400000" cy="2808000"/>
+                    </a:xfrm>
+                    <a:prstGeom prst="rect"/>
+                  </pic:spPr>
+                </pic:pic>
+              </a:graphicData>
+            </a:graphic>
+          </wp:anchor>
+        </w:drawing>
+      </w:r>
+    </w:p>
+    <w:p>
+      <w:pPr>
+        <w:pStyle w:val="题注"/>
+        <w:jc w:val="center"/>
+      </w:pPr>
+      <w:r>
+        <w:t xml:space="preserve">图 </w:t>
+      </w:r>
+      <w:r>
+        <w:fldChar w:fldCharType="begin" w:dirty="true"/>
+      </w:r>
+      <w:r>
+        <w:instrText xml:space="preserve"> SEQ Figure \* ARABIC </w:instrText>
+      </w:r>
+      <w:r>
+        <w:fldChar w:fldCharType="separate"/>
+      </w:r>
+      <w:r>
+        <w:t>13</w:t>
+      </w:r>
+      <w:r>
+        <w:fldChar w:fldCharType="end"/>
+      </w:r>
+      <w:r>
+        <w:t xml:space="preserve"> decode attention 从 stock 到自研内核的带宽演进</w:t>
+      </w:r>
+    </w:p>
+    <w:p>
+      <w:pPr>
+        <w:pStyle w:val="题注"/>
+        <w:jc w:val="center"/>
+      </w:pPr>
+      <w:r>
+        <w:drawing>
+          <wp:anchor distT="72000" distB="72000" distL="72000" distR="72000" simplePos="0" relativeHeight="251659264" behindDoc="0" locked="0" layoutInCell="1" allowOverlap="1">
+            <wp:simplePos x="0" y="0"/>
+            <wp:positionH relativeFrom="column">
+              <wp:align>center</wp:align>
+            </wp:positionH>
+            <wp:positionV relativeFrom="paragraph">
+              <wp:align>top</wp:align>
+            </wp:positionV>
+            <wp:extent cx="5400000" cy="2520000"/>
+            <wp:wrapTopAndBottom/>
+            <wp:docPr id="14" name="Picture 14"/>
+            <wp:cNvGraphicFramePr xmlns:a="http://schemas.openxmlformats.org/drawingml/2006/main">
+              <a:graphicFrameLocks noChangeAspect="1"/>
+            </wp:cNvGraphicFramePr>
+            <a:graphic xmlns:a="http://schemas.openxmlformats.org/drawingml/2006/main" xmlns:pic="http://schemas.openxmlformats.org/drawingml/2006/picture">
+              <a:graphicData uri="http://schemas.openxmlformats.org/drawingml/2006/picture">
+                <pic:pic>
+                  <pic:nvPicPr>
+                    <pic:cNvPr id="0" name="fig13_run_variance.png"/>
+                    <pic:cNvPicPr/>
+                  </pic:nvPicPr>
+                  <pic:blipFill>
+                    <a:blip r:embed="rId24"/>
+                    <a:stretch>
+                      <a:fillRect/>
+                    </a:stretch>
+                  </pic:blipFill>
+                  <pic:spPr>
+                    <a:xfrm>
+                      <a:off x="0" y="0"/>
+                      <a:ext cx="5400000" cy="2520000"/>
+                    </a:xfrm>
+                    <a:prstGeom prst="rect"/>
+                  </pic:spPr>
+                </pic:pic>
+              </a:graphicData>
+            </a:graphic>
+          </wp:anchor>
+        </w:drawing>
+      </w:r>
+    </w:p>
+    <w:p>
+      <w:pPr>
+        <w:pStyle w:val="题注"/>
+        <w:jc w:val="center"/>
+      </w:pPr>
+      <w:r>
+        <w:t xml:space="preserve">图 </w:t>
+      </w:r>
+      <w:r>
+        <w:fldChar w:fldCharType="begin" w:dirty="true"/>
+      </w:r>
+      <w:r>
+        <w:instrText xml:space="preserve"> SEQ Figure \* ARABIC </w:instrText>
+      </w:r>
+      <w:r>
+        <w:fldChar w:fldCharType="separate"/>
+      </w:r>
+      <w:r>
+        <w:t>14</w:t>
+      </w:r>
+      <w:r>
+        <w:fldChar w:fldCharType="end"/>
+      </w:r>
+      <w:r>
+        <w:t xml:space="preserve"> 官方 benchmark 连续 4 次 run 的吞吐波动：4k 需取均值，16k 极稳</w:t>
+      </w:r>
+    </w:p>
+    <w:p>
+      <w:pPr>
+        <w:pStyle w:val="题注"/>
+        <w:jc w:val="center"/>
+      </w:pPr>
+      <w:r>
+        <w:t xml:space="preserve">图 </w:t>
+      </w:r>
+      <w:r>
+        <w:fldChar w:fldCharType="begin" w:dirty="true"/>
+      </w:r>
+      <w:r>
+        <w:instrText xml:space="preserve"> SEQ Figure \* ARABIC </w:instrText>
+      </w:r>
+      <w:r>
+        <w:fldChar w:fldCharType="separate"/>
+      </w:r>
+      <w:r>
+        <w:t>15</w:t>
+      </w:r>
+      <w:r>
+        <w:fldChar w:fldCharType="end"/>
+      </w:r>
+      <w:r>
+        <w:t xml:space="preserve"> NSEG × 并发度的耗时分布（kv=16384，ms/层）</w:t>
+      </w:r>
+    </w:p>
+    <w:p>
+      <w:pPr>
+        <w:pStyle w:val="题注"/>
+        <w:jc w:val="center"/>
+      </w:pPr>
+      <w:r>
+        <w:t xml:space="preserve">图 </w:t>
+      </w:r>
+      <w:r>
+        <w:fldChar w:fldCharType="begin" w:dirty="true"/>
+      </w:r>
+      <w:r>
+        <w:instrText xml:space="preserve"> SEQ Figure \* ARABIC </w:instrText>
+      </w:r>
+      <w:r>
+        <w:fldChar w:fldCharType="separate"/>
+      </w:r>
+      <w:r>
+        <w:t>16</w:t>
+      </w:r>
+      <w:r>
+        <w:fldChar w:fldCharType="end"/>
+      </w:r>
+      <w:r>
+        <w:t xml:space="preserve"> NSEG × 并发度的有效带宽分布（kv=16384，GB/s）</w:t>
+      </w:r>
+    </w:p>
+    <w:p>
+      <w:pPr>
+        <w:pStyle w:val="题注"/>
+        <w:jc w:val="center"/>
+      </w:pPr>
+      <w:r>
+        <w:t xml:space="preserve">图 </w:t>
+      </w:r>
+      <w:r>
+        <w:fldChar w:fldCharType="begin" w:dirty="true"/>
+      </w:r>
+      <w:r>
+        <w:instrText xml:space="preserve"> SEQ Figure \* ARABIC </w:instrText>
+      </w:r>
+      <w:r>
+        <w:fldChar w:fldCharType="separate"/>
+      </w:r>
+      <w:r>
+        <w:t>17</w:t>
+      </w:r>
+      <w:r>
+        <w:fldChar w:fldCharType="end"/>
+      </w:r>
+      <w:r>
+        <w:t xml:space="preserve"> NSEG × 并发度的耗时分布（kv=4096，ms/层）</w:t>
+      </w:r>
+    </w:p>
     <w:sectPr>
       <w:headerReference w:type="default" r:id="rId9"/>
       <w:footerReference w:type="default" r:id="rId10"/>

</xml_diff>